<commit_message>
docs: 📝 updated docs
time estimations + meetings minutes + SRS WIP
</commit_message>
<xml_diff>
--- a/assets/docs/minutes/ISEC.22-10-2025.v1.0.docx
+++ b/assets/docs/minutes/ISEC.22-10-2025.v1.0.docx
@@ -3273,7 +3273,12 @@
       </w:pPr>
     </w:p>
     <w:sectPr>
-      <w:headerReference w:type="default" r:id="rId9"/>
+      <w:headerReference w:type="even" r:id="rId9"/>
+      <w:headerReference w:type="default" r:id="rId10"/>
+      <w:footerReference w:type="even" r:id="rId11"/>
+      <w:footerReference w:type="default" r:id="rId12"/>
+      <w:headerReference w:type="first" r:id="rId13"/>
+      <w:footerReference w:type="first" r:id="rId14"/>
       <w:endnotePr>
         <w:numFmt w:val="decimal"/>
       </w:endnotePr>
@@ -3305,6 +3310,36 @@
 </w:endnotes>
 </file>
 
+<file path=word/footer1.xml><?xml version="1.0" encoding="utf-8"?>
+<w:ftr xmlns:wpc="http://schemas.microsoft.com/office/word/2010/wordprocessingCanvas" xmlns:cx="http://schemas.microsoft.com/office/drawing/2014/chartex" xmlns:cx1="http://schemas.microsoft.com/office/drawing/2015/9/8/chartex" xmlns:cx2="http://schemas.microsoft.com/office/drawing/2015/10/21/chartex" xmlns:cx3="http://schemas.microsoft.com/office/drawing/2016/5/9/chartex" xmlns:cx4="http://schemas.microsoft.com/office/drawing/2016/5/10/chartex" xmlns:cx5="http://schemas.microsoft.com/office/drawing/2016/5/11/chartex" xmlns:cx6="http://schemas.microsoft.com/office/drawing/2016/5/12/chartex" xmlns:cx7="http://schemas.microsoft.com/office/drawing/2016/5/13/chartex" xmlns:cx8="http://schemas.microsoft.com/office/drawing/2016/5/14/chartex" xmlns:mc="http://schemas.openxmlformats.org/markup-compatibility/2006" xmlns:aink="http://schemas.microsoft.com/office/drawing/2016/ink" xmlns:am3d="http://schemas.microsoft.com/office/drawing/2017/model3d" xmlns:o="urn:schemas-microsoft-com:office:office" xmlns:oel="http://schemas.microsoft.com/office/2019/extlst" xmlns:r="http://schemas.openxmlformats.org/officeDocument/2006/relationships" xmlns:m="http://schemas.openxmlformats.org/officeDocument/2006/math" xmlns:v="urn:schemas-microsoft-com:vml" xmlns:wp14="http://schemas.microsoft.com/office/word/2010/wordprocessingDrawing" xmlns:wp="http://schemas.openxmlformats.org/drawingml/2006/wordprocessingDrawing" xmlns:w10="urn:schemas-microsoft-com:office:word" xmlns:w="http://schemas.openxmlformats.org/wordprocessingml/2006/main" xmlns:w14="http://schemas.microsoft.com/office/word/2010/wordml" xmlns:w15="http://schemas.microsoft.com/office/word/2012/wordml" xmlns:w16cex="http://schemas.microsoft.com/office/word/2018/wordml/cex" xmlns:w16cid="http://schemas.microsoft.com/office/word/2016/wordml/cid" xmlns:w16="http://schemas.microsoft.com/office/word/2018/wordml" xmlns:w16du="http://schemas.microsoft.com/office/word/2023/wordml/word16du" xmlns:w16sdtdh="http://schemas.microsoft.com/office/word/2020/wordml/sdtdatahash" xmlns:w16sdtfl="http://schemas.microsoft.com/office/word/2024/wordml/sdtformatlock" xmlns:w16se="http://schemas.microsoft.com/office/word/2015/wordml/symex" xmlns:wpg="http://schemas.microsoft.com/office/word/2010/wordprocessingGroup" xmlns:wpi="http://schemas.microsoft.com/office/word/2010/wordprocessingInk" xmlns:wne="http://schemas.microsoft.com/office/word/2006/wordml" xmlns:wps="http://schemas.microsoft.com/office/word/2010/wordprocessingShape" mc:Ignorable="w14 w15 w16se w16cid w16 w16cex w16sdtdh w16sdtfl w16du wp14">
+  <w:p>
+    <w:pPr>
+      <w:pStyle w:val="Rodap"/>
+    </w:pPr>
+  </w:p>
+</w:ftr>
+</file>
+
+<file path=word/footer2.xml><?xml version="1.0" encoding="utf-8"?>
+<w:ftr xmlns:wpc="http://schemas.microsoft.com/office/word/2010/wordprocessingCanvas" xmlns:cx="http://schemas.microsoft.com/office/drawing/2014/chartex" xmlns:cx1="http://schemas.microsoft.com/office/drawing/2015/9/8/chartex" xmlns:cx2="http://schemas.microsoft.com/office/drawing/2015/10/21/chartex" xmlns:cx3="http://schemas.microsoft.com/office/drawing/2016/5/9/chartex" xmlns:cx4="http://schemas.microsoft.com/office/drawing/2016/5/10/chartex" xmlns:cx5="http://schemas.microsoft.com/office/drawing/2016/5/11/chartex" xmlns:cx6="http://schemas.microsoft.com/office/drawing/2016/5/12/chartex" xmlns:cx7="http://schemas.microsoft.com/office/drawing/2016/5/13/chartex" xmlns:cx8="http://schemas.microsoft.com/office/drawing/2016/5/14/chartex" xmlns:mc="http://schemas.openxmlformats.org/markup-compatibility/2006" xmlns:aink="http://schemas.microsoft.com/office/drawing/2016/ink" xmlns:am3d="http://schemas.microsoft.com/office/drawing/2017/model3d" xmlns:o="urn:schemas-microsoft-com:office:office" xmlns:oel="http://schemas.microsoft.com/office/2019/extlst" xmlns:r="http://schemas.openxmlformats.org/officeDocument/2006/relationships" xmlns:m="http://schemas.openxmlformats.org/officeDocument/2006/math" xmlns:v="urn:schemas-microsoft-com:vml" xmlns:wp14="http://schemas.microsoft.com/office/word/2010/wordprocessingDrawing" xmlns:wp="http://schemas.openxmlformats.org/drawingml/2006/wordprocessingDrawing" xmlns:w10="urn:schemas-microsoft-com:office:word" xmlns:w="http://schemas.openxmlformats.org/wordprocessingml/2006/main" xmlns:w14="http://schemas.microsoft.com/office/word/2010/wordml" xmlns:w15="http://schemas.microsoft.com/office/word/2012/wordml" xmlns:w16cex="http://schemas.microsoft.com/office/word/2018/wordml/cex" xmlns:w16cid="http://schemas.microsoft.com/office/word/2016/wordml/cid" xmlns:w16="http://schemas.microsoft.com/office/word/2018/wordml" xmlns:w16du="http://schemas.microsoft.com/office/word/2023/wordml/word16du" xmlns:w16sdtdh="http://schemas.microsoft.com/office/word/2020/wordml/sdtdatahash" xmlns:w16sdtfl="http://schemas.microsoft.com/office/word/2024/wordml/sdtformatlock" xmlns:w16se="http://schemas.microsoft.com/office/word/2015/wordml/symex" xmlns:wpg="http://schemas.microsoft.com/office/word/2010/wordprocessingGroup" xmlns:wpi="http://schemas.microsoft.com/office/word/2010/wordprocessingInk" xmlns:wne="http://schemas.microsoft.com/office/word/2006/wordml" xmlns:wps="http://schemas.microsoft.com/office/word/2010/wordprocessingShape" mc:Ignorable="w14 w15 w16se w16cid w16 w16cex w16sdtdh w16sdtfl w16du wp14">
+  <w:p>
+    <w:pPr>
+      <w:pStyle w:val="Rodap"/>
+    </w:pPr>
+  </w:p>
+</w:ftr>
+</file>
+
+<file path=word/footer3.xml><?xml version="1.0" encoding="utf-8"?>
+<w:ftr xmlns:wpc="http://schemas.microsoft.com/office/word/2010/wordprocessingCanvas" xmlns:cx="http://schemas.microsoft.com/office/drawing/2014/chartex" xmlns:cx1="http://schemas.microsoft.com/office/drawing/2015/9/8/chartex" xmlns:cx2="http://schemas.microsoft.com/office/drawing/2015/10/21/chartex" xmlns:cx3="http://schemas.microsoft.com/office/drawing/2016/5/9/chartex" xmlns:cx4="http://schemas.microsoft.com/office/drawing/2016/5/10/chartex" xmlns:cx5="http://schemas.microsoft.com/office/drawing/2016/5/11/chartex" xmlns:cx6="http://schemas.microsoft.com/office/drawing/2016/5/12/chartex" xmlns:cx7="http://schemas.microsoft.com/office/drawing/2016/5/13/chartex" xmlns:cx8="http://schemas.microsoft.com/office/drawing/2016/5/14/chartex" xmlns:mc="http://schemas.openxmlformats.org/markup-compatibility/2006" xmlns:aink="http://schemas.microsoft.com/office/drawing/2016/ink" xmlns:am3d="http://schemas.microsoft.com/office/drawing/2017/model3d" xmlns:o="urn:schemas-microsoft-com:office:office" xmlns:oel="http://schemas.microsoft.com/office/2019/extlst" xmlns:r="http://schemas.openxmlformats.org/officeDocument/2006/relationships" xmlns:m="http://schemas.openxmlformats.org/officeDocument/2006/math" xmlns:v="urn:schemas-microsoft-com:vml" xmlns:wp14="http://schemas.microsoft.com/office/word/2010/wordprocessingDrawing" xmlns:wp="http://schemas.openxmlformats.org/drawingml/2006/wordprocessingDrawing" xmlns:w10="urn:schemas-microsoft-com:office:word" xmlns:w="http://schemas.openxmlformats.org/wordprocessingml/2006/main" xmlns:w14="http://schemas.microsoft.com/office/word/2010/wordml" xmlns:w15="http://schemas.microsoft.com/office/word/2012/wordml" xmlns:w16cex="http://schemas.microsoft.com/office/word/2018/wordml/cex" xmlns:w16cid="http://schemas.microsoft.com/office/word/2016/wordml/cid" xmlns:w16="http://schemas.microsoft.com/office/word/2018/wordml" xmlns:w16du="http://schemas.microsoft.com/office/word/2023/wordml/word16du" xmlns:w16sdtdh="http://schemas.microsoft.com/office/word/2020/wordml/sdtdatahash" xmlns:w16sdtfl="http://schemas.microsoft.com/office/word/2024/wordml/sdtformatlock" xmlns:w16se="http://schemas.microsoft.com/office/word/2015/wordml/symex" xmlns:wpg="http://schemas.microsoft.com/office/word/2010/wordprocessingGroup" xmlns:wpi="http://schemas.microsoft.com/office/word/2010/wordprocessingInk" xmlns:wne="http://schemas.microsoft.com/office/word/2006/wordml" xmlns:wps="http://schemas.microsoft.com/office/word/2010/wordprocessingShape" mc:Ignorable="w14 w15 w16se w16cid w16 w16cex w16sdtdh w16sdtfl w16du wp14">
+  <w:p>
+    <w:pPr>
+      <w:pStyle w:val="Rodap"/>
+    </w:pPr>
+  </w:p>
+</w:ftr>
+</file>
+
 <file path=word/footnotes.xml><?xml version="1.0" encoding="utf-8"?>
 <w:footnotes xmlns:wpc="http://schemas.microsoft.com/office/word/2010/wordprocessingCanvas" xmlns:cx="http://schemas.microsoft.com/office/drawing/2014/chartex" xmlns:cx1="http://schemas.microsoft.com/office/drawing/2015/9/8/chartex" xmlns:cx2="http://schemas.microsoft.com/office/drawing/2015/10/21/chartex" xmlns:cx3="http://schemas.microsoft.com/office/drawing/2016/5/9/chartex" xmlns:cx4="http://schemas.microsoft.com/office/drawing/2016/5/10/chartex" xmlns:cx5="http://schemas.microsoft.com/office/drawing/2016/5/11/chartex" xmlns:cx6="http://schemas.microsoft.com/office/drawing/2016/5/12/chartex" xmlns:cx7="http://schemas.microsoft.com/office/drawing/2016/5/13/chartex" xmlns:cx8="http://schemas.microsoft.com/office/drawing/2016/5/14/chartex" xmlns:mc="http://schemas.openxmlformats.org/markup-compatibility/2006" xmlns:aink="http://schemas.microsoft.com/office/drawing/2016/ink" xmlns:am3d="http://schemas.microsoft.com/office/drawing/2017/model3d" xmlns:o="urn:schemas-microsoft-com:office:office" xmlns:oel="http://schemas.microsoft.com/office/2019/extlst" xmlns:r="http://schemas.openxmlformats.org/officeDocument/2006/relationships" xmlns:m="http://schemas.openxmlformats.org/officeDocument/2006/math" xmlns:v="urn:schemas-microsoft-com:vml" xmlns:wp14="http://schemas.microsoft.com/office/word/2010/wordprocessingDrawing" xmlns:wp="http://schemas.openxmlformats.org/drawingml/2006/wordprocessingDrawing" xmlns:w10="urn:schemas-microsoft-com:office:word" xmlns:w="http://schemas.openxmlformats.org/wordprocessingml/2006/main" xmlns:w14="http://schemas.microsoft.com/office/word/2010/wordml" xmlns:w15="http://schemas.microsoft.com/office/word/2012/wordml" xmlns:w16cex="http://schemas.microsoft.com/office/word/2018/wordml/cex" xmlns:w16cid="http://schemas.microsoft.com/office/word/2016/wordml/cid" xmlns:w16="http://schemas.microsoft.com/office/word/2018/wordml" xmlns:w16du="http://schemas.microsoft.com/office/word/2023/wordml/word16du" xmlns:w16sdtdh="http://schemas.microsoft.com/office/word/2020/wordml/sdtdatahash" xmlns:w16sdtfl="http://schemas.microsoft.com/office/word/2024/wordml/sdtformatlock" xmlns:w16se="http://schemas.microsoft.com/office/word/2015/wordml/symex" xmlns:wpg="http://schemas.microsoft.com/office/word/2010/wordprocessingGroup" xmlns:wpi="http://schemas.microsoft.com/office/word/2010/wordprocessingInk" xmlns:wne="http://schemas.microsoft.com/office/word/2006/wordml" xmlns:wps="http://schemas.microsoft.com/office/word/2010/wordprocessingShape" mc:Ignorable="w14 w15 w16se w16cid w16 w16cex w16sdtdh w16sdtfl w16du wp14">
   <w:footnote w:type="separator" w:id="-1">
@@ -3328,6 +3363,16 @@
 <w:hdr xmlns:wpc="http://schemas.microsoft.com/office/word/2010/wordprocessingCanvas" xmlns:cx="http://schemas.microsoft.com/office/drawing/2014/chartex" xmlns:cx1="http://schemas.microsoft.com/office/drawing/2015/9/8/chartex" xmlns:cx2="http://schemas.microsoft.com/office/drawing/2015/10/21/chartex" xmlns:cx3="http://schemas.microsoft.com/office/drawing/2016/5/9/chartex" xmlns:cx4="http://schemas.microsoft.com/office/drawing/2016/5/10/chartex" xmlns:cx5="http://schemas.microsoft.com/office/drawing/2016/5/11/chartex" xmlns:cx6="http://schemas.microsoft.com/office/drawing/2016/5/12/chartex" xmlns:cx7="http://schemas.microsoft.com/office/drawing/2016/5/13/chartex" xmlns:cx8="http://schemas.microsoft.com/office/drawing/2016/5/14/chartex" xmlns:mc="http://schemas.openxmlformats.org/markup-compatibility/2006" xmlns:aink="http://schemas.microsoft.com/office/drawing/2016/ink" xmlns:am3d="http://schemas.microsoft.com/office/drawing/2017/model3d" xmlns:o="urn:schemas-microsoft-com:office:office" xmlns:oel="http://schemas.microsoft.com/office/2019/extlst" xmlns:r="http://schemas.openxmlformats.org/officeDocument/2006/relationships" xmlns:m="http://schemas.openxmlformats.org/officeDocument/2006/math" xmlns:v="urn:schemas-microsoft-com:vml" xmlns:wp14="http://schemas.microsoft.com/office/word/2010/wordprocessingDrawing" xmlns:wp="http://schemas.openxmlformats.org/drawingml/2006/wordprocessingDrawing" xmlns:w10="urn:schemas-microsoft-com:office:word" xmlns:w="http://schemas.openxmlformats.org/wordprocessingml/2006/main" xmlns:w14="http://schemas.microsoft.com/office/word/2010/wordml" xmlns:w15="http://schemas.microsoft.com/office/word/2012/wordml" xmlns:w16cex="http://schemas.microsoft.com/office/word/2018/wordml/cex" xmlns:w16cid="http://schemas.microsoft.com/office/word/2016/wordml/cid" xmlns:w16="http://schemas.microsoft.com/office/word/2018/wordml" xmlns:w16du="http://schemas.microsoft.com/office/word/2023/wordml/word16du" xmlns:w16sdtdh="http://schemas.microsoft.com/office/word/2020/wordml/sdtdatahash" xmlns:w16sdtfl="http://schemas.microsoft.com/office/word/2024/wordml/sdtformatlock" xmlns:w16se="http://schemas.microsoft.com/office/word/2015/wordml/symex" xmlns:wpg="http://schemas.microsoft.com/office/word/2010/wordprocessingGroup" xmlns:wpi="http://schemas.microsoft.com/office/word/2010/wordprocessingInk" xmlns:wne="http://schemas.microsoft.com/office/word/2006/wordml" xmlns:wps="http://schemas.microsoft.com/office/word/2010/wordprocessingShape" mc:Ignorable="w14 w15 w16se w16cid w16 w16cex w16sdtdh w16sdtfl w16du wp14">
   <w:p>
     <w:pPr>
+      <w:pStyle w:val="Cabealho"/>
+    </w:pPr>
+  </w:p>
+</w:hdr>
+</file>
+
+<file path=word/header2.xml><?xml version="1.0" encoding="utf-8"?>
+<w:hdr xmlns:wpc="http://schemas.microsoft.com/office/word/2010/wordprocessingCanvas" xmlns:cx="http://schemas.microsoft.com/office/drawing/2014/chartex" xmlns:cx1="http://schemas.microsoft.com/office/drawing/2015/9/8/chartex" xmlns:cx2="http://schemas.microsoft.com/office/drawing/2015/10/21/chartex" xmlns:cx3="http://schemas.microsoft.com/office/drawing/2016/5/9/chartex" xmlns:cx4="http://schemas.microsoft.com/office/drawing/2016/5/10/chartex" xmlns:cx5="http://schemas.microsoft.com/office/drawing/2016/5/11/chartex" xmlns:cx6="http://schemas.microsoft.com/office/drawing/2016/5/12/chartex" xmlns:cx7="http://schemas.microsoft.com/office/drawing/2016/5/13/chartex" xmlns:cx8="http://schemas.microsoft.com/office/drawing/2016/5/14/chartex" xmlns:mc="http://schemas.openxmlformats.org/markup-compatibility/2006" xmlns:aink="http://schemas.microsoft.com/office/drawing/2016/ink" xmlns:am3d="http://schemas.microsoft.com/office/drawing/2017/model3d" xmlns:o="urn:schemas-microsoft-com:office:office" xmlns:oel="http://schemas.microsoft.com/office/2019/extlst" xmlns:r="http://schemas.openxmlformats.org/officeDocument/2006/relationships" xmlns:m="http://schemas.openxmlformats.org/officeDocument/2006/math" xmlns:v="urn:schemas-microsoft-com:vml" xmlns:wp14="http://schemas.microsoft.com/office/word/2010/wordprocessingDrawing" xmlns:wp="http://schemas.openxmlformats.org/drawingml/2006/wordprocessingDrawing" xmlns:w10="urn:schemas-microsoft-com:office:word" xmlns:w="http://schemas.openxmlformats.org/wordprocessingml/2006/main" xmlns:w14="http://schemas.microsoft.com/office/word/2010/wordml" xmlns:w15="http://schemas.microsoft.com/office/word/2012/wordml" xmlns:w16cex="http://schemas.microsoft.com/office/word/2018/wordml/cex" xmlns:w16cid="http://schemas.microsoft.com/office/word/2016/wordml/cid" xmlns:w16="http://schemas.microsoft.com/office/word/2018/wordml" xmlns:w16du="http://schemas.microsoft.com/office/word/2023/wordml/word16du" xmlns:w16sdtdh="http://schemas.microsoft.com/office/word/2020/wordml/sdtdatahash" xmlns:w16sdtfl="http://schemas.microsoft.com/office/word/2024/wordml/sdtformatlock" xmlns:w16se="http://schemas.microsoft.com/office/word/2015/wordml/symex" xmlns:wpg="http://schemas.microsoft.com/office/word/2010/wordprocessingGroup" xmlns:wpi="http://schemas.microsoft.com/office/word/2010/wordprocessingInk" xmlns:wne="http://schemas.microsoft.com/office/word/2006/wordml" xmlns:wps="http://schemas.microsoft.com/office/word/2010/wordprocessingShape" mc:Ignorable="w14 w15 w16se w16cid w16 w16cex w16sdtdh w16sdtfl w16du wp14">
+  <w:p>
+    <w:pPr>
       <w:widowControl/>
       <w:tabs>
         <w:tab w:val="center" w:pos="4536"/>
@@ -3336,29 +3381,32 @@
       <w:spacing w:after="200" w:line="276" w:lineRule="auto"/>
       <w:jc w:val="right"/>
       <w:rPr>
-        <w:rFonts w:asciiTheme="minorHAnsi" w:hAnsiTheme="minorHAnsi" w:cstheme="minorHAnsi"/>
-        <w:noProof/>
-        <w:sz w:val="18"/>
-        <w:szCs w:val="18"/>
-        <w:lang w:eastAsia="en-GB"/>
-      </w:rPr>
-    </w:pPr>
-    <w:r>
-      <w:rPr>
         <w:rFonts w:asciiTheme="minorHAnsi" w:eastAsia="PMingLiU" w:hAnsiTheme="minorHAnsi" w:cstheme="minorHAnsi"/>
+        <w:b/>
+        <w:bCs/>
         <w:color w:val="984806" w:themeColor="accent6" w:themeShade="80"/>
         <w:sz w:val="18"/>
         <w:szCs w:val="18"/>
       </w:rPr>
-      <w:t>&lt;Project Name&gt;</w:t>
+    </w:pPr>
+    <w:r>
+      <w:rPr>
+        <w:rFonts w:asciiTheme="minorHAnsi" w:eastAsia="PMingLiU" w:hAnsiTheme="minorHAnsi" w:cstheme="minorHAnsi"/>
+        <w:b/>
+        <w:color w:val="984806" w:themeColor="accent6" w:themeShade="80"/>
+        <w:sz w:val="18"/>
+        <w:szCs w:val="18"/>
+      </w:rPr>
+      <w:t>ISEC Internship and Project Partnerships Management System</w:t>
     </w:r>
     <w:r>
       <w:rPr>
-        <w:rFonts w:asciiTheme="minorHAnsi" w:eastAsia="Calibri" w:hAnsiTheme="minorHAnsi" w:cstheme="minorHAnsi"/>
-        <w:noProof/>
+        <w:rFonts w:asciiTheme="minorHAnsi" w:eastAsia="PMingLiU" w:hAnsiTheme="minorHAnsi" w:cstheme="minorHAnsi"/>
+        <w:b/>
+        <w:bCs/>
+        <w:color w:val="984806" w:themeColor="accent6" w:themeShade="80"/>
         <w:sz w:val="18"/>
         <w:szCs w:val="18"/>
-        <w:lang w:eastAsia="en-GB"/>
       </w:rPr>
       <w:t xml:space="preserve"> </w:t>
     </w:r>
@@ -3370,6 +3418,16 @@
       </w:rPr>
       <w:t>Minutes of Meeting</w:t>
     </w:r>
+  </w:p>
+</w:hdr>
+</file>
+
+<file path=word/header3.xml><?xml version="1.0" encoding="utf-8"?>
+<w:hdr xmlns:wpc="http://schemas.microsoft.com/office/word/2010/wordprocessingCanvas" xmlns:cx="http://schemas.microsoft.com/office/drawing/2014/chartex" xmlns:cx1="http://schemas.microsoft.com/office/drawing/2015/9/8/chartex" xmlns:cx2="http://schemas.microsoft.com/office/drawing/2015/10/21/chartex" xmlns:cx3="http://schemas.microsoft.com/office/drawing/2016/5/9/chartex" xmlns:cx4="http://schemas.microsoft.com/office/drawing/2016/5/10/chartex" xmlns:cx5="http://schemas.microsoft.com/office/drawing/2016/5/11/chartex" xmlns:cx6="http://schemas.microsoft.com/office/drawing/2016/5/12/chartex" xmlns:cx7="http://schemas.microsoft.com/office/drawing/2016/5/13/chartex" xmlns:cx8="http://schemas.microsoft.com/office/drawing/2016/5/14/chartex" xmlns:mc="http://schemas.openxmlformats.org/markup-compatibility/2006" xmlns:aink="http://schemas.microsoft.com/office/drawing/2016/ink" xmlns:am3d="http://schemas.microsoft.com/office/drawing/2017/model3d" xmlns:o="urn:schemas-microsoft-com:office:office" xmlns:oel="http://schemas.microsoft.com/office/2019/extlst" xmlns:r="http://schemas.openxmlformats.org/officeDocument/2006/relationships" xmlns:m="http://schemas.openxmlformats.org/officeDocument/2006/math" xmlns:v="urn:schemas-microsoft-com:vml" xmlns:wp14="http://schemas.microsoft.com/office/word/2010/wordprocessingDrawing" xmlns:wp="http://schemas.openxmlformats.org/drawingml/2006/wordprocessingDrawing" xmlns:w10="urn:schemas-microsoft-com:office:word" xmlns:w="http://schemas.openxmlformats.org/wordprocessingml/2006/main" xmlns:w14="http://schemas.microsoft.com/office/word/2010/wordml" xmlns:w15="http://schemas.microsoft.com/office/word/2012/wordml" xmlns:w16cex="http://schemas.microsoft.com/office/word/2018/wordml/cex" xmlns:w16cid="http://schemas.microsoft.com/office/word/2016/wordml/cid" xmlns:w16="http://schemas.microsoft.com/office/word/2018/wordml" xmlns:w16du="http://schemas.microsoft.com/office/word/2023/wordml/word16du" xmlns:w16sdtdh="http://schemas.microsoft.com/office/word/2020/wordml/sdtdatahash" xmlns:w16sdtfl="http://schemas.microsoft.com/office/word/2024/wordml/sdtformatlock" xmlns:w16se="http://schemas.microsoft.com/office/word/2015/wordml/symex" xmlns:wpg="http://schemas.microsoft.com/office/word/2010/wordprocessingGroup" xmlns:wpi="http://schemas.microsoft.com/office/word/2010/wordprocessingInk" xmlns:wne="http://schemas.microsoft.com/office/word/2006/wordml" xmlns:wps="http://schemas.microsoft.com/office/word/2010/wordprocessingShape" mc:Ignorable="w14 w15 w16se w16cid w16 w16cex w16sdtdh w16sdtfl w16du wp14">
+  <w:p>
+    <w:pPr>
+      <w:pStyle w:val="Cabealho"/>
+    </w:pPr>
   </w:p>
 </w:hdr>
 </file>
@@ -3397,7 +3455,7 @@
         <v:path o:extrusionok="f" gradientshapeok="t" o:connecttype="rect"/>
         <o:lock v:ext="edit" aspectratio="t"/>
       </v:shapetype>
-      <v:shape id="_x0000_i1109" type="#_x0000_t75" style="width:11.25pt;height:9pt" o:bullet="t">
+      <v:shape id="_x0000_i1079" type="#_x0000_t75" style="width:11.25pt;height:9pt" o:bullet="t">
         <v:imagedata r:id="rId1" o:title="BD21295_"/>
       </v:shape>
     </w:pict>

</xml_diff>